<commit_message>
Fix APA formatting: Add retrieval dates, correct citations, regenerate DOCX files
</commit_message>
<xml_diff>
--- a/ENGL1102_English_Composition_2/Unit2_Research_Sources/Assignment/Unit2_Written_Assignment_FORMATTED.docx
+++ b/ENGL1102_English_Composition_2/Unit2_Research_Sources/Assignment/Unit2_Written_Assignment_FORMATTED.docx
@@ -389,7 +389,7 @@
           <w:rFonts w:ascii="Times New Roman" w:hAnsi="Times New Roman"/>
           <w:sz w:val="24"/>
         </w:rPr>
-        <w:t xml:space="preserve">. U.S. Department of Homeland Security. https://www.cisa.gov/topics/cybersecurity-best-practices/organizations-and-cyber-safety/small-and-medium-sized-businesses</w:t>
+        <w:t xml:space="preserve">. U.S. Department of Homeland Security. Retrieved January 31, 2026, from https://www.cisa.gov/topics/cybersecurity-best-practices/organizations-and-cyber-safety/small-and-medium-sized-businesses</w:t>
       </w:r>
     </w:p>
     <w:p>
@@ -583,7 +583,7 @@
           <w:rFonts w:ascii="Times New Roman" w:hAnsi="Times New Roman"/>
           <w:sz w:val="24"/>
         </w:rPr>
-        <w:t xml:space="preserve">. https://www.verizon.com/business/resources/reports/dbir/</w:t>
+        <w:t xml:space="preserve">. Retrieved January 31, 2026, from https://www.verizon.com/business/resources/reports/dbir/</w:t>
       </w:r>
     </w:p>
     <w:p>
@@ -665,7 +665,7 @@
           <w:rFonts w:ascii="Times New Roman" w:hAnsi="Times New Roman"/>
           <w:sz w:val="24"/>
         </w:rPr>
-        <w:t xml:space="preserve">. U.S. Department of Commerce. https://www.nist.gov/cyberframework</w:t>
+        <w:t xml:space="preserve">. U.S. Department of Commerce. Retrieved January 31, 2026, from https://www.nist.gov/cyberframework</w:t>
       </w:r>
     </w:p>
     <w:p>
@@ -747,7 +747,7 @@
           <w:rFonts w:ascii="Times New Roman" w:hAnsi="Times New Roman"/>
           <w:sz w:val="24"/>
         </w:rPr>
-        <w:t xml:space="preserve">. https://hbr.org/2023/08/why-small-businesses-are-prime-targets-for-cyberattacks</w:t>
+        <w:t xml:space="preserve">. Retrieved January 31, 2026, from https://hbr.org/2023/08/why-small-businesses-are-prime-targets-for-cyberattacks</w:t>
       </w:r>
     </w:p>
     <w:p>
@@ -900,7 +900,7 @@
           <w:rFonts w:ascii="Times New Roman" w:hAnsi="Times New Roman"/>
           <w:sz w:val="24"/>
         </w:rPr>
-        <w:t xml:space="preserve">Cybersecurity &amp; Infrastructure Security Agency. (2023).</w:t>
+        <w:t xml:space="preserve">CFI Team. (2023, November 19). SMART goals.</w:t>
       </w:r>
       <w:r>
         <w:rPr>
@@ -916,14 +916,14 @@
           <w:iCs/>
           <w:sz w:val="24"/>
         </w:rPr>
-        <w:t xml:space="preserve">Cybersecurity for small businesses</w:t>
-      </w:r>
-      <w:r>
-        <w:rPr>
-          <w:rFonts w:ascii="Times New Roman" w:hAnsi="Times New Roman"/>
-          <w:sz w:val="24"/>
-        </w:rPr>
-        <w:t xml:space="preserve">. U.S. Department of Homeland Security. https://www.cisa.gov/topics/cybersecurity-best-practices/organizations-and-cyber-safety/small-and-medium-sized-businesses</w:t>
+        <w:t xml:space="preserve">Corporate Finance Institute</w:t>
+      </w:r>
+      <w:r>
+        <w:rPr>
+          <w:rFonts w:ascii="Times New Roman" w:hAnsi="Times New Roman"/>
+          <w:sz w:val="24"/>
+        </w:rPr>
+        <w:t xml:space="preserve">. Retrieved January 31, 2026, from https://corporatefinanceinstitute.com/resources/management/smart-goal/</w:t>
       </w:r>
     </w:p>
     <w:p>
@@ -936,7 +936,7 @@
           <w:rFonts w:ascii="Times New Roman" w:hAnsi="Times New Roman"/>
           <w:sz w:val="24"/>
         </w:rPr>
-        <w:t xml:space="preserve">CFI Team. (2023, November 19). SMART goals.</w:t>
+        <w:t xml:space="preserve">Cybersecurity &amp; Infrastructure Security Agency. (2023).</w:t>
       </w:r>
       <w:r>
         <w:rPr>
@@ -952,14 +952,14 @@
           <w:iCs/>
           <w:sz w:val="24"/>
         </w:rPr>
-        <w:t xml:space="preserve">Corporate Finance Institute</w:t>
-      </w:r>
-      <w:r>
-        <w:rPr>
-          <w:rFonts w:ascii="Times New Roman" w:hAnsi="Times New Roman"/>
-          <w:sz w:val="24"/>
-        </w:rPr>
-        <w:t xml:space="preserve">. https://corporatefinanceinstitute.com/resources/management/smart-goal/</w:t>
+        <w:t xml:space="preserve">Cybersecurity for small businesses</w:t>
+      </w:r>
+      <w:r>
+        <w:rPr>
+          <w:rFonts w:ascii="Times New Roman" w:hAnsi="Times New Roman"/>
+          <w:sz w:val="24"/>
+        </w:rPr>
+        <w:t xml:space="preserve">. U.S. Department of Homeland Security. Retrieved January 31, 2026, from https://www.cisa.gov/topics/cybersecurity-best-practices/organizations-and-cyber-safety/small-and-medium-sized-businesses</w:t>
       </w:r>
     </w:p>
     <w:p>
@@ -1031,7 +1031,7 @@
           <w:rFonts w:ascii="Times New Roman" w:hAnsi="Times New Roman"/>
           <w:sz w:val="24"/>
         </w:rPr>
-        <w:t xml:space="preserve">. https://www.scribbr.com/working-with-sources/credible-sources/</w:t>
+        <w:t xml:space="preserve">. Retrieved January 31, 2026, from https://www.scribbr.com/working-with-sources/credible-sources/</w:t>
       </w:r>
     </w:p>
     <w:p>
@@ -1067,7 +1067,7 @@
           <w:rFonts w:ascii="Times New Roman" w:hAnsi="Times New Roman"/>
           <w:sz w:val="24"/>
         </w:rPr>
-        <w:t xml:space="preserve">. https://staysafeonline.org/</w:t>
+        <w:t xml:space="preserve">. Retrieved January 31, 2026, from https://staysafeonline.org/</w:t>
       </w:r>
     </w:p>
     <w:p>
@@ -1103,7 +1103,7 @@
           <w:rFonts w:ascii="Times New Roman" w:hAnsi="Times New Roman"/>
           <w:sz w:val="24"/>
         </w:rPr>
-        <w:t xml:space="preserve">. U.S. Department of Commerce. https://www.nist.gov/cyberframework</w:t>
+        <w:t xml:space="preserve">. U.S. Department of Commerce. Retrieved January 31, 2026, from https://www.nist.gov/cyberframework</w:t>
       </w:r>
     </w:p>
     <w:p>
@@ -1139,7 +1139,7 @@
           <w:rFonts w:ascii="Times New Roman" w:hAnsi="Times New Roman"/>
           <w:sz w:val="24"/>
         </w:rPr>
-        <w:t xml:space="preserve">. https://www.scribbr.com/working-with-sources/finding-sources/</w:t>
+        <w:t xml:space="preserve">. Retrieved January 31, 2026, from https://www.scribbr.com/working-with-sources/finding-sources/</w:t>
       </w:r>
     </w:p>
     <w:p>
@@ -1175,7 +1175,7 @@
           <w:rFonts w:ascii="Times New Roman" w:hAnsi="Times New Roman"/>
           <w:sz w:val="24"/>
         </w:rPr>
-        <w:t xml:space="preserve">. https://www.verizon.com/business/resources/reports/dbir/</w:t>
+        <w:t xml:space="preserve">. Retrieved January 31, 2026, from https://www.verizon.com/business/resources/reports/dbir/</w:t>
       </w:r>
     </w:p>
     <w:p>
@@ -1211,7 +1211,7 @@
           <w:rFonts w:ascii="Times New Roman" w:hAnsi="Times New Roman"/>
           <w:sz w:val="24"/>
         </w:rPr>
-        <w:t xml:space="preserve">. https://hbr.org/2023/08/why-small-businesses-are-prime-targets-for-cyberattacks</w:t>
+        <w:t xml:space="preserve">. Retrieved January 31, 2026, from https://hbr.org/2023/08/why-small-businesses-are-prime-targets-for-cyberattacks</w:t>
       </w:r>
     </w:p>
     <w:p>

</xml_diff>

<commit_message>
Condense written assignment to 649 words (meets 500-750 requirement), maintain all rubric elements
</commit_message>
<xml_diff>
--- a/ENGL1102_English_Composition_2/Unit2_Research_Sources/Assignment/Unit2_Written_Assignment_FORMATTED.docx
+++ b/ENGL1102_English_Composition_2/Unit2_Research_Sources/Assignment/Unit2_Written_Assignment_FORMATTED.docx
@@ -158,18 +158,15 @@
           <w:rFonts w:ascii="Times New Roman" w:hAnsi="Times New Roman"/>
           <w:sz w:val="24"/>
         </w:rPr>
-        <w:t xml:space="preserve">This hypothesis aligns with SMART goals criteria (CFI Team, 2023):</w:t>
-      </w:r>
-    </w:p>
-    <w:p>
-      <w:pPr>
-        <w:pStyle w:val="Compact"/>
-        <w:numPr>
-          <w:ilvl w:val="0"/>
-          <w:numId w:val="1001"/>
-        </w:numPr>
-        <w:spacing w:line="480" w:lineRule="auto"/>
-      </w:pPr>
+        <w:t xml:space="preserve">This hypothesis aligns with SMART goals criteria (CFI Team, 2023): It is</w:t>
+      </w:r>
+      <w:r>
+        <w:rPr>
+          <w:rFonts w:ascii="Times New Roman" w:hAnsi="Times New Roman"/>
+          <w:sz w:val="24"/>
+        </w:rPr>
+        <w:t xml:space="preserve"> </w:t>
+      </w:r>
       <w:r>
         <w:rPr>
           <w:rFonts w:ascii="Times New Roman" w:hAnsi="Times New Roman"/>
@@ -184,18 +181,22 @@
           <w:rFonts w:ascii="Times New Roman" w:hAnsi="Times New Roman"/>
           <w:sz w:val="24"/>
         </w:rPr>
-        <w:t xml:space="preserve">: Focuses on small businesses implementing defined cybersecurity measures (employee training, multi-factor authentication, security audits) and their impact on data breach frequency.</w:t>
-      </w:r>
-    </w:p>
-    <w:p>
-      <w:pPr>
-        <w:pStyle w:val="Compact"/>
-        <w:numPr>
-          <w:ilvl w:val="0"/>
-          <w:numId w:val="1001"/>
-        </w:numPr>
-        <w:spacing w:line="480" w:lineRule="auto"/>
-      </w:pPr>
+        <w:t xml:space="preserve"> </w:t>
+      </w:r>
+      <w:r>
+        <w:rPr>
+          <w:rFonts w:ascii="Times New Roman" w:hAnsi="Times New Roman"/>
+          <w:sz w:val="24"/>
+        </w:rPr>
+        <w:t xml:space="preserve">by defining exact measures and outcomes;</w:t>
+      </w:r>
+      <w:r>
+        <w:rPr>
+          <w:rFonts w:ascii="Times New Roman" w:hAnsi="Times New Roman"/>
+          <w:sz w:val="24"/>
+        </w:rPr>
+        <w:t xml:space="preserve"> </w:t>
+      </w:r>
       <w:r>
         <w:rPr>
           <w:rFonts w:ascii="Times New Roman" w:hAnsi="Times New Roman"/>
@@ -210,18 +211,22 @@
           <w:rFonts w:ascii="Times New Roman" w:hAnsi="Times New Roman"/>
           <w:sz w:val="24"/>
         </w:rPr>
-        <w:t xml:space="preserve">: Quantifies investment (10% of IT budget), outcome (50% reduction in breaches), and timeframe (24 months), allowing for empirical testing through comparative analysis.</w:t>
-      </w:r>
-    </w:p>
-    <w:p>
-      <w:pPr>
-        <w:pStyle w:val="Compact"/>
-        <w:numPr>
-          <w:ilvl w:val="0"/>
-          <w:numId w:val="1001"/>
-        </w:numPr>
-        <w:spacing w:line="480" w:lineRule="auto"/>
-      </w:pPr>
+        <w:t xml:space="preserve"> </w:t>
+      </w:r>
+      <w:r>
+        <w:rPr>
+          <w:rFonts w:ascii="Times New Roman" w:hAnsi="Times New Roman"/>
+          <w:sz w:val="24"/>
+        </w:rPr>
+        <w:t xml:space="preserve">through quantifiable metrics (10% budget, 50% reduction, 24 months);</w:t>
+      </w:r>
+      <w:r>
+        <w:rPr>
+          <w:rFonts w:ascii="Times New Roman" w:hAnsi="Times New Roman"/>
+          <w:sz w:val="24"/>
+        </w:rPr>
+        <w:t xml:space="preserve"> </w:t>
+      </w:r>
       <w:r>
         <w:rPr>
           <w:rFonts w:ascii="Times New Roman" w:hAnsi="Times New Roman"/>
@@ -236,18 +241,22 @@
           <w:rFonts w:ascii="Times New Roman" w:hAnsi="Times New Roman"/>
           <w:sz w:val="24"/>
         </w:rPr>
-        <w:t xml:space="preserve">: The 10% investment threshold is realistic for small businesses, as industry recommendations suggest 6-15% of IT budgets should address security (Cybersecurity &amp; Infrastructure Security Agency, 2023).</w:t>
-      </w:r>
-    </w:p>
-    <w:p>
-      <w:pPr>
-        <w:pStyle w:val="Compact"/>
-        <w:numPr>
-          <w:ilvl w:val="0"/>
-          <w:numId w:val="1001"/>
-        </w:numPr>
-        <w:spacing w:line="480" w:lineRule="auto"/>
-      </w:pPr>
+        <w:t xml:space="preserve"> </w:t>
+      </w:r>
+      <w:r>
+        <w:rPr>
+          <w:rFonts w:ascii="Times New Roman" w:hAnsi="Times New Roman"/>
+          <w:sz w:val="24"/>
+        </w:rPr>
+        <w:t xml:space="preserve">as industry standards recommend 6-15% IT budget allocation for security (Cybersecurity &amp; Infrastructure Security Agency, 2023);</w:t>
+      </w:r>
+      <w:r>
+        <w:rPr>
+          <w:rFonts w:ascii="Times New Roman" w:hAnsi="Times New Roman"/>
+          <w:sz w:val="24"/>
+        </w:rPr>
+        <w:t xml:space="preserve"> </w:t>
+      </w:r>
       <w:r>
         <w:rPr>
           <w:rFonts w:ascii="Times New Roman" w:hAnsi="Times New Roman"/>
@@ -262,18 +271,22 @@
           <w:rFonts w:ascii="Times New Roman" w:hAnsi="Times New Roman"/>
           <w:sz w:val="24"/>
         </w:rPr>
-        <w:t xml:space="preserve">: Addresses a critical business problem—60% of small businesses close within six months of a cyberattack, making this research directly applicable to business survival (National Cyber Security Alliance, 2023).</w:t>
-      </w:r>
-    </w:p>
-    <w:p>
-      <w:pPr>
-        <w:pStyle w:val="Compact"/>
-        <w:numPr>
-          <w:ilvl w:val="0"/>
-          <w:numId w:val="1001"/>
-        </w:numPr>
-        <w:spacing w:line="480" w:lineRule="auto"/>
-      </w:pPr>
+        <w:t xml:space="preserve"> </w:t>
+      </w:r>
+      <w:r>
+        <w:rPr>
+          <w:rFonts w:ascii="Times New Roman" w:hAnsi="Times New Roman"/>
+          <w:sz w:val="24"/>
+        </w:rPr>
+        <w:t xml:space="preserve">since 60% of small businesses close within six months of cyberattacks (National Cyber Security Alliance, 2023); and</w:t>
+      </w:r>
+      <w:r>
+        <w:rPr>
+          <w:rFonts w:ascii="Times New Roman" w:hAnsi="Times New Roman"/>
+          <w:sz w:val="24"/>
+        </w:rPr>
+        <w:t xml:space="preserve"> </w:t>
+      </w:r>
       <w:r>
         <w:rPr>
           <w:rFonts w:ascii="Times New Roman" w:hAnsi="Times New Roman"/>
@@ -288,20 +301,14 @@
           <w:rFonts w:ascii="Times New Roman" w:hAnsi="Times New Roman"/>
           <w:sz w:val="24"/>
         </w:rPr>
-        <w:t xml:space="preserve">: Establishes a clear 24-month evaluation period, sufficient to capture breach patterns while remaining practical for longitudinal study.</w:t>
-      </w:r>
-    </w:p>
-    <w:p>
-      <w:pPr>
-        <w:pStyle w:val="FirstParagraph"/>
-        <w:spacing w:line="480" w:lineRule="auto"/>
-      </w:pPr>
-      <w:r>
-        <w:rPr>
-          <w:rFonts w:ascii="Times New Roman" w:hAnsi="Times New Roman"/>
-          <w:sz w:val="24"/>
-        </w:rPr>
-        <w:t xml:space="preserve">This hypothesis is testable through quantitative methods comparing breach incidents between small businesses with comprehensive cybersecurity investments and those with minimal security measures, controlling for variables such as industry sector, employee count, and revenue size.</w:t>
+        <w:t xml:space="preserve"> </w:t>
+      </w:r>
+      <w:r>
+        <w:rPr>
+          <w:rFonts w:ascii="Times New Roman" w:hAnsi="Times New Roman"/>
+          <w:sz w:val="24"/>
+        </w:rPr>
+        <w:t xml:space="preserve">with a clear 24-month evaluation period. This hypothesis can be tested through quantitative comparison of breach incidents between businesses with comprehensive versus minimal cybersecurity investments.</w:t>
       </w:r>
     </w:p>
     <w:p>
@@ -333,7 +340,7 @@
         <w:t xml:space="preserve">Credible Sources for Literature Review</w:t>
       </w:r>
     </w:p>
-    <w:bookmarkStart w:id="21" w:name="X989790bee7558b5f921dce8ef41c9bebae79cdf"/>
+    <w:bookmarkStart w:id="21" w:name="Xa56ed748ae3b545ec41d1fab11b9d7581ef9277"/>
     <w:p>
       <w:pPr>
         <w:pStyle w:val="Heading3"/>
@@ -344,7 +351,7 @@
           <w:rFonts w:ascii="Times New Roman" w:hAnsi="Times New Roman"/>
           <w:sz w:val="24"/>
         </w:rPr>
-        <w:t xml:space="preserve">Source 1: Cybersecurity &amp; Infrastructure Security Agency (CISA) – Small Business Resources</w:t>
+        <w:t xml:space="preserve">Source 1: Cybersecurity &amp; Infrastructure Security Agency (CISA)</w:t>
       </w:r>
     </w:p>
     <w:p>
@@ -404,18 +411,18 @@
           <w:bCs/>
           <w:sz w:val="24"/>
         </w:rPr>
-        <w:t xml:space="preserve">Credibility Analysis</w:t>
-      </w:r>
-      <w:r>
-        <w:rPr>
-          <w:rFonts w:ascii="Times New Roman" w:hAnsi="Times New Roman"/>
-          <w:sz w:val="24"/>
-        </w:rPr>
-        <w:t xml:space="preserve">: CISA is the authoritative U.S. federal agency responsible for cybersecurity infrastructure protection, operating under the Department of Homeland Security. This source is highly credible because it represents official government guidance developed by cybersecurity experts and informed by national threat intelligence. The agency collaborates with private sector partners and academic institutions to develop evidence-based recommendations. As a .gov domain, it meets the highest standards for reliability and is regularly updated to reflect emerging threats. The absence of commercial bias—since CISA does not sell security products—ensures objective, public-interest-focused information. This source provides foundational best practices and statistical data on small business vulnerabilities that establish the research context.</w:t>
+        <w:t xml:space="preserve">Credibility</w:t>
+      </w:r>
+      <w:r>
+        <w:rPr>
+          <w:rFonts w:ascii="Times New Roman" w:hAnsi="Times New Roman"/>
+          <w:sz w:val="24"/>
+        </w:rPr>
+        <w:t xml:space="preserve">: CISA is the authoritative U.S. federal agency for cybersecurity infrastructure protection under the Department of Homeland Security. As a .gov domain with no commercial interests, it provides unbiased, expert-developed guidance informed by national threat intelligence. The agency collaborates with private sector partners and academic institutions to create evidence-based recommendations regularly updated for emerging threats, making it highly reliable for foundational cybersecurity best practices.</w:t>
       </w:r>
     </w:p>
     <w:bookmarkEnd w:id="21"/>
-    <w:bookmarkStart w:id="22" w:name="X16243b33eed4c62c77ef1ad1019f4ed2c6b954d"/>
+    <w:bookmarkStart w:id="22" w:name="Xa1a2223fc2ebfb711568b8a744540dd28d903f9"/>
     <w:p>
       <w:pPr>
         <w:pStyle w:val="Heading3"/>
@@ -426,7 +433,7 @@
           <w:rFonts w:ascii="Times New Roman" w:hAnsi="Times New Roman"/>
           <w:sz w:val="24"/>
         </w:rPr>
-        <w:t xml:space="preserve">Source 2: Journal of Cybersecurity – Peer-Reviewed Academic Research</w:t>
+        <w:t xml:space="preserve">Source 2: Journal of Cybersecurity – Peer-Reviewed Research</w:t>
       </w:r>
     </w:p>
     <w:p>
@@ -486,14 +493,51 @@
           <w:bCs/>
           <w:sz w:val="24"/>
         </w:rPr>
-        <w:t xml:space="preserve">Credibility Analysis</w:t>
-      </w:r>
-      <w:r>
-        <w:rPr>
-          <w:rFonts w:ascii="Times New Roman" w:hAnsi="Times New Roman"/>
-          <w:sz w:val="24"/>
-        </w:rPr>
-        <w:t xml:space="preserve">: The</w:t>
+        <w:t xml:space="preserve">Credibility</w:t>
+      </w:r>
+      <w:r>
+        <w:rPr>
+          <w:rFonts w:ascii="Times New Roman" w:hAnsi="Times New Roman"/>
+          <w:sz w:val="24"/>
+        </w:rPr>
+        <w:t xml:space="preserve">: This peer-reviewed academic journal published by Oxford University Press ensures multiple independent experts evaluate research methodology before publication (George, 2024). The authors are established researchers from the University of St. Gallen’s Institute of Insurance Economics, providing academic authority. The empirical approach analyzing quantitative insurance industry data offers methodologically rigorous evidence, while the 2022 publication date and DOI ensure currency and permanent verifiability.</w:t>
+      </w:r>
+    </w:p>
+    <w:bookmarkEnd w:id="22"/>
+    <w:bookmarkStart w:id="23" w:name="X3291adaa3be6efab719dd610eeee46ba3d98375"/>
+    <w:p>
+      <w:pPr>
+        <w:pStyle w:val="Heading3"/>
+        <w:spacing w:line="480" w:lineRule="auto"/>
+      </w:pPr>
+      <w:r>
+        <w:rPr>
+          <w:rFonts w:ascii="Times New Roman" w:hAnsi="Times New Roman"/>
+          <w:sz w:val="24"/>
+        </w:rPr>
+        <w:t xml:space="preserve">Source 3: Verizon Data Breach Investigations Report (DBIR)</w:t>
+      </w:r>
+    </w:p>
+    <w:p>
+      <w:pPr>
+        <w:pStyle w:val="FirstParagraph"/>
+        <w:spacing w:line="480" w:lineRule="auto"/>
+      </w:pPr>
+      <w:r>
+        <w:rPr>
+          <w:rFonts w:ascii="Times New Roman" w:hAnsi="Times New Roman"/>
+          <w:b/>
+          <w:bCs/>
+          <w:sz w:val="24"/>
+        </w:rPr>
+        <w:t xml:space="preserve">Citation</w:t>
+      </w:r>
+      <w:r>
+        <w:rPr>
+          <w:rFonts w:ascii="Times New Roman" w:hAnsi="Times New Roman"/>
+          <w:sz w:val="24"/>
+        </w:rPr>
+        <w:t xml:space="preserve">: Verizon. (2023).</w:t>
       </w:r>
       <w:r>
         <w:rPr>
@@ -509,41 +553,19 @@
           <w:iCs/>
           <w:sz w:val="24"/>
         </w:rPr>
-        <w:t xml:space="preserve">Journal of Cybersecurity</w:t>
-      </w:r>
-      <w:r>
-        <w:rPr>
-          <w:rFonts w:ascii="Times New Roman" w:hAnsi="Times New Roman"/>
-          <w:sz w:val="24"/>
-        </w:rPr>
-        <w:t xml:space="preserve"> </w:t>
-      </w:r>
-      <w:r>
-        <w:rPr>
-          <w:rFonts w:ascii="Times New Roman" w:hAnsi="Times New Roman"/>
-          <w:sz w:val="24"/>
-        </w:rPr>
-        <w:t xml:space="preserve">is a peer-reviewed, open-access academic journal published by Oxford University Press, one of the most prestigious academic publishers globally. Peer review ensures that multiple independent experts evaluate research methodology, data analysis, and conclusions before publication, filtering out flawed or biased studies (George, 2024). The authors, Martin Eling and Werner Schnell, are established researchers affiliated with the University of St. Gallen’s Institute of Insurance Economics, lending academic authority to their work. The article’s empirical approach—analyzing quantitative data from the insurance industry—provides methodologically rigorous evidence about cyber risk financial impacts. The DOI (Digital Object Identifier) ensures permanent accessibility and verifiability, while the 2022 publication date guarantees currency in the rapidly evolving cybersecurity field.</w:t>
-      </w:r>
-    </w:p>
-    <w:bookmarkEnd w:id="22"/>
-    <w:bookmarkStart w:id="23" w:name="X3291adaa3be6efab719dd610eeee46ba3d98375"/>
-    <w:p>
-      <w:pPr>
-        <w:pStyle w:val="Heading3"/>
-        <w:spacing w:line="480" w:lineRule="auto"/>
-      </w:pPr>
-      <w:r>
-        <w:rPr>
-          <w:rFonts w:ascii="Times New Roman" w:hAnsi="Times New Roman"/>
-          <w:sz w:val="24"/>
-        </w:rPr>
-        <w:t xml:space="preserve">Source 3: Verizon Data Breach Investigations Report (DBIR)</w:t>
-      </w:r>
-    </w:p>
-    <w:p>
-      <w:pPr>
-        <w:pStyle w:val="FirstParagraph"/>
+        <w:t xml:space="preserve">2023 Data Breach Investigations Report</w:t>
+      </w:r>
+      <w:r>
+        <w:rPr>
+          <w:rFonts w:ascii="Times New Roman" w:hAnsi="Times New Roman"/>
+          <w:sz w:val="24"/>
+        </w:rPr>
+        <w:t xml:space="preserve">. Retrieved January 31, 2026, from https://www.verizon.com/business/resources/reports/dbir/</w:t>
+      </w:r>
+    </w:p>
+    <w:p>
+      <w:pPr>
+        <w:pStyle w:val="BodyText"/>
         <w:spacing w:line="480" w:lineRule="auto"/>
       </w:pPr>
       <w:r>
@@ -553,6 +575,43 @@
           <w:bCs/>
           <w:sz w:val="24"/>
         </w:rPr>
+        <w:t xml:space="preserve">Credibility</w:t>
+      </w:r>
+      <w:r>
+        <w:rPr>
+          <w:rFonts w:ascii="Times New Roman" w:hAnsi="Times New Roman"/>
+          <w:sz w:val="24"/>
+        </w:rPr>
+        <w:t xml:space="preserve">: The Verizon DBIR analyzes real-world breaches across multiple sectors with comprehensive methodology—the 2023 report examined 16,312 security incidents and 5,199 confirmed breaches from 94 contributing organizations worldwide (Verizon, 2023). This large sample size provides statistical reliability beyond individual case studies. The report’s methodological transparency and widespread citation by academic researchers, government agencies, and security professionals demonstrate cross-sector validation despite Verizon’s commercial status.</w:t>
+      </w:r>
+    </w:p>
+    <w:bookmarkEnd w:id="23"/>
+    <w:bookmarkStart w:id="24" w:name="Xb33a1dfc53ac2b1babe742d7629fa3cb0d07798"/>
+    <w:p>
+      <w:pPr>
+        <w:pStyle w:val="Heading3"/>
+        <w:spacing w:line="480" w:lineRule="auto"/>
+      </w:pPr>
+      <w:r>
+        <w:rPr>
+          <w:rFonts w:ascii="Times New Roman" w:hAnsi="Times New Roman"/>
+          <w:sz w:val="24"/>
+        </w:rPr>
+        <w:t xml:space="preserve">Source 4: National Institute of Standards and Technology (NIST)</w:t>
+      </w:r>
+    </w:p>
+    <w:p>
+      <w:pPr>
+        <w:pStyle w:val="FirstParagraph"/>
+        <w:spacing w:line="480" w:lineRule="auto"/>
+      </w:pPr>
+      <w:r>
+        <w:rPr>
+          <w:rFonts w:ascii="Times New Roman" w:hAnsi="Times New Roman"/>
+          <w:b/>
+          <w:bCs/>
+          <w:sz w:val="24"/>
+        </w:rPr>
         <w:t xml:space="preserve">Citation</w:t>
       </w:r>
       <w:r>
@@ -560,7 +619,7 @@
           <w:rFonts w:ascii="Times New Roman" w:hAnsi="Times New Roman"/>
           <w:sz w:val="24"/>
         </w:rPr>
-        <w:t xml:space="preserve">: Verizon. (2023).</w:t>
+        <w:t xml:space="preserve">: National Institute of Standards and Technology. (2024).</w:t>
       </w:r>
       <w:r>
         <w:rPr>
@@ -576,14 +635,14 @@
           <w:iCs/>
           <w:sz w:val="24"/>
         </w:rPr>
-        <w:t xml:space="preserve">2023 Data Breach Investigations Report</w:t>
-      </w:r>
-      <w:r>
-        <w:rPr>
-          <w:rFonts w:ascii="Times New Roman" w:hAnsi="Times New Roman"/>
-          <w:sz w:val="24"/>
-        </w:rPr>
-        <w:t xml:space="preserve">. Retrieved January 31, 2026, from https://www.verizon.com/business/resources/reports/dbir/</w:t>
+        <w:t xml:space="preserve">NIST Cybersecurity Framework 2.0</w:t>
+      </w:r>
+      <w:r>
+        <w:rPr>
+          <w:rFonts w:ascii="Times New Roman" w:hAnsi="Times New Roman"/>
+          <w:sz w:val="24"/>
+        </w:rPr>
+        <w:t xml:space="preserve">. U.S. Department of Commerce. Retrieved January 31, 2026, from https://www.nist.gov/cyberframework</w:t>
       </w:r>
     </w:p>
     <w:p>
@@ -598,18 +657,18 @@
           <w:bCs/>
           <w:sz w:val="24"/>
         </w:rPr>
-        <w:t xml:space="preserve">Credibility Analysis</w:t>
-      </w:r>
-      <w:r>
-        <w:rPr>
-          <w:rFonts w:ascii="Times New Roman" w:hAnsi="Times New Roman"/>
-          <w:sz w:val="24"/>
-        </w:rPr>
-        <w:t xml:space="preserve">: The Verizon DBIR is an industry-leading annual report analyzing thousands of real-world data breaches and security incidents across multiple sectors and organization sizes. Its credibility stems from its comprehensive data collection methodology—the 2023 report analyzed 16,312 security incidents and 5,199 confirmed breaches from 94 contributing organizations worldwide (Verizon, 2023). This large sample size and multi-source data aggregation provide statistical reliability that individual case studies cannot match. Verizon’s cybersecurity division employs experienced threat researchers and forensic investigators who analyze breach patterns using standardized frameworks. The report’s transparency about methodology, including data limitations and classification criteria, demonstrates scientific rigor. While Verizon is a commercial entity, the DBIR is freely available and widely cited by academic researchers, government agencies, and security professionals, indicating cross-sector validation of its findings.</w:t>
-      </w:r>
-    </w:p>
-    <w:bookmarkEnd w:id="23"/>
-    <w:bookmarkStart w:id="24" w:name="X046b2b175240f3b8b706f2643268f5c8a11052c"/>
+        <w:t xml:space="preserve">Credibility</w:t>
+      </w:r>
+      <w:r>
+        <w:rPr>
+          <w:rFonts w:ascii="Times New Roman" w:hAnsi="Times New Roman"/>
+          <w:sz w:val="24"/>
+        </w:rPr>
+        <w:t xml:space="preserve">: NIST is a non-regulatory federal agency developing technology standards and guidelines. The NIST Cybersecurity Framework is internationally recognized as the gold standard for organizational risk management, adopted by businesses and governments worldwide. Its credibility stems from extensive collaboration with private sector stakeholders, academic experts, and international partners. As a .gov source, it provides unbiased, evidence-based guidance with regular updates ensuring relevance to evolving threats.</w:t>
+      </w:r>
+    </w:p>
+    <w:bookmarkEnd w:id="24"/>
+    <w:bookmarkStart w:id="25" w:name="source-5-harvard-business-review"/>
     <w:p>
       <w:pPr>
         <w:pStyle w:val="Heading3"/>
@@ -620,7 +679,7 @@
           <w:rFonts w:ascii="Times New Roman" w:hAnsi="Times New Roman"/>
           <w:sz w:val="24"/>
         </w:rPr>
-        <w:t xml:space="preserve">Source 4: National Institute of Standards and Technology (NIST) Cybersecurity Framework</w:t>
+        <w:t xml:space="preserve">Source 5: Harvard Business Review</w:t>
       </w:r>
     </w:p>
     <w:p>
@@ -642,7 +701,7 @@
           <w:rFonts w:ascii="Times New Roman" w:hAnsi="Times New Roman"/>
           <w:sz w:val="24"/>
         </w:rPr>
-        <w:t xml:space="preserve">: National Institute of Standards and Technology. (2024).</w:t>
+        <w:t xml:space="preserve">: Zwilling, M., &amp; Anaya, L. (2023, August 15). Why small businesses are prime targets for cyberattacks.</w:t>
       </w:r>
       <w:r>
         <w:rPr>
@@ -658,14 +717,14 @@
           <w:iCs/>
           <w:sz w:val="24"/>
         </w:rPr>
-        <w:t xml:space="preserve">NIST Cybersecurity Framework 2.0</w:t>
-      </w:r>
-      <w:r>
-        <w:rPr>
-          <w:rFonts w:ascii="Times New Roman" w:hAnsi="Times New Roman"/>
-          <w:sz w:val="24"/>
-        </w:rPr>
-        <w:t xml:space="preserve">. U.S. Department of Commerce. Retrieved January 31, 2026, from https://www.nist.gov/cyberframework</w:t>
+        <w:t xml:space="preserve">Harvard Business Review</w:t>
+      </w:r>
+      <w:r>
+        <w:rPr>
+          <w:rFonts w:ascii="Times New Roman" w:hAnsi="Times New Roman"/>
+          <w:sz w:val="24"/>
+        </w:rPr>
+        <w:t xml:space="preserve">. Retrieved January 31, 2026, from https://hbr.org/2023/08/why-small-businesses-are-prime-targets-for-cyberattacks</w:t>
       </w:r>
     </w:p>
     <w:p>
@@ -680,51 +739,14 @@
           <w:bCs/>
           <w:sz w:val="24"/>
         </w:rPr>
-        <w:t xml:space="preserve">Credibility Analysis</w:t>
-      </w:r>
-      <w:r>
-        <w:rPr>
-          <w:rFonts w:ascii="Times New Roman" w:hAnsi="Times New Roman"/>
-          <w:sz w:val="24"/>
-        </w:rPr>
-        <w:t xml:space="preserve">: NIST is a non-regulatory federal agency within the U.S. Department of Commerce responsible for developing technology standards and guidelines. The NIST Cybersecurity Framework is internationally recognized as the gold standard for organizational cybersecurity risk management, adopted by businesses, government agencies, and critical infrastructure operators worldwide. Its credibility derives from its development process, which involved extensive collaboration with private sector stakeholders, academic experts, and international partners over multiple years. The framework is evidence-based, drawing on documented best practices and lessons learned from real-world incidents. As a .gov source with no commercial interests, NIST provides unbiased, scientifically grounded guidance. The framework’s voluntary nature and widespread adoption across industries demonstrate its practical applicability and effectiveness. Regular updates—including the 2024 version 2.0—ensure the framework remains relevant to evolving cyber threats.</w:t>
-      </w:r>
-    </w:p>
-    <w:bookmarkEnd w:id="24"/>
-    <w:bookmarkStart w:id="25" w:name="X1501ab6dd54c4de9ef4b36bcb4164a83e0dccce"/>
-    <w:p>
-      <w:pPr>
-        <w:pStyle w:val="Heading3"/>
-        <w:spacing w:line="480" w:lineRule="auto"/>
-      </w:pPr>
-      <w:r>
-        <w:rPr>
-          <w:rFonts w:ascii="Times New Roman" w:hAnsi="Times New Roman"/>
-          <w:sz w:val="24"/>
-        </w:rPr>
-        <w:t xml:space="preserve">Source 5: Harvard Business Review – Small Business Cybersecurity Economics</w:t>
-      </w:r>
-    </w:p>
-    <w:p>
-      <w:pPr>
-        <w:pStyle w:val="FirstParagraph"/>
-        <w:spacing w:line="480" w:lineRule="auto"/>
-      </w:pPr>
-      <w:r>
-        <w:rPr>
-          <w:rFonts w:ascii="Times New Roman" w:hAnsi="Times New Roman"/>
-          <w:b/>
-          <w:bCs/>
-          <w:sz w:val="24"/>
-        </w:rPr>
-        <w:t xml:space="preserve">Citation</w:t>
-      </w:r>
-      <w:r>
-        <w:rPr>
-          <w:rFonts w:ascii="Times New Roman" w:hAnsi="Times New Roman"/>
-          <w:sz w:val="24"/>
-        </w:rPr>
-        <w:t xml:space="preserve">: Zwilling, M., &amp; Anaya, L. (2023, August 15). Why small businesses are prime targets for cyberattacks.</w:t>
+        <w:t xml:space="preserve">Credibility</w:t>
+      </w:r>
+      <w:r>
+        <w:rPr>
+          <w:rFonts w:ascii="Times New Roman" w:hAnsi="Times New Roman"/>
+          <w:sz w:val="24"/>
+        </w:rPr>
+        <w:t xml:space="preserve">:</w:t>
       </w:r>
       <w:r>
         <w:rPr>
@@ -747,59 +769,14 @@
           <w:rFonts w:ascii="Times New Roman" w:hAnsi="Times New Roman"/>
           <w:sz w:val="24"/>
         </w:rPr>
-        <w:t xml:space="preserve">. Retrieved January 31, 2026, from https://hbr.org/2023/08/why-small-businesses-are-prime-targets-for-cyberattacks</w:t>
-      </w:r>
-    </w:p>
-    <w:p>
-      <w:pPr>
-        <w:pStyle w:val="BodyText"/>
-        <w:spacing w:line="480" w:lineRule="auto"/>
-      </w:pPr>
-      <w:r>
-        <w:rPr>
-          <w:rFonts w:ascii="Times New Roman" w:hAnsi="Times New Roman"/>
-          <w:b/>
-          <w:bCs/>
-          <w:sz w:val="24"/>
-        </w:rPr>
-        <w:t xml:space="preserve">Credibility Analysis</w:t>
-      </w:r>
-      <w:r>
-        <w:rPr>
-          <w:rFonts w:ascii="Times New Roman" w:hAnsi="Times New Roman"/>
-          <w:sz w:val="24"/>
-        </w:rPr>
-        <w:t xml:space="preserve">:</w:t>
-      </w:r>
-      <w:r>
-        <w:rPr>
-          <w:rFonts w:ascii="Times New Roman" w:hAnsi="Times New Roman"/>
-          <w:sz w:val="24"/>
-        </w:rPr>
-        <w:t xml:space="preserve"> </w:t>
-      </w:r>
-      <w:r>
-        <w:rPr>
-          <w:rFonts w:ascii="Times New Roman" w:hAnsi="Times New Roman"/>
-          <w:i/>
-          <w:iCs/>
-          <w:sz w:val="24"/>
-        </w:rPr>
-        <w:t xml:space="preserve">Harvard Business Review</w:t>
-      </w:r>
-      <w:r>
-        <w:rPr>
-          <w:rFonts w:ascii="Times New Roman" w:hAnsi="Times New Roman"/>
-          <w:sz w:val="24"/>
-        </w:rPr>
-        <w:t xml:space="preserve"> </w:t>
-      </w:r>
-      <w:r>
-        <w:rPr>
-          <w:rFonts w:ascii="Times New Roman" w:hAnsi="Times New Roman"/>
-          <w:sz w:val="24"/>
-        </w:rPr>
-        <w:t xml:space="preserve">(HBR) is a premier business management publication affiliated with Harvard Business School, one of the world’s leading academic institutions. HBR articles undergo editorial review by business experts and are written by credentialed authors—in this case, Martin Zwilling (startup advisor and founder of Startup Professionals) and Luis Anaya (cybersecurity consultant). While not peer-reviewed in the academic sense, HBR maintains rigorous editorial standards and publishes evidence-based analysis supported by research citations and expert interviews (Ryan, 2023). The publication’s reputation depends on accuracy and practical applicability, incentivizing thorough fact-checking. This article specifically addresses the economic vulnerabilities of small businesses to cyber threats, providing business-focused analysis that complements technical sources. HBR’s audience includes executives and business leaders, ensuring content is both credible and actionable for decision-makers implementing cybersecurity strategies.</w:t>
+        <w:t xml:space="preserve"> </w:t>
+      </w:r>
+      <w:r>
+        <w:rPr>
+          <w:rFonts w:ascii="Times New Roman" w:hAnsi="Times New Roman"/>
+          <w:sz w:val="24"/>
+        </w:rPr>
+        <w:t xml:space="preserve">is a premier business publication affiliated with Harvard Business School. Articles undergo editorial review by business experts and are written by credentialed authors—Martin Zwilling (startup advisor) and Luis Anaya (cybersecurity consultant). While not peer-reviewed academically, HBR maintains rigorous editorial standards with evidence-based analysis supported by research citations (Ryan, 2023). This article addresses economic vulnerabilities of small businesses, providing business-focused analysis complementing technical sources.</w:t>
       </w:r>
     </w:p>
     <w:p>
@@ -842,23 +819,7 @@
           <w:rFonts w:ascii="Times New Roman" w:hAnsi="Times New Roman"/>
           <w:sz w:val="24"/>
         </w:rPr>
-        <w:t xml:space="preserve">This research hypothesis and literature review foundation establish a framework for investigating how cybersecurity investment levels correlate with data breach prevention in small businesses. The five credible sources represent diverse perspectives—government agencies (CISA, NIST), peer-reviewed academic research (</w:t>
-      </w:r>
-      <w:r>
-        <w:rPr>
-          <w:rFonts w:ascii="Times New Roman" w:hAnsi="Times New Roman"/>
-          <w:i/>
-          <w:iCs/>
-          <w:sz w:val="24"/>
-        </w:rPr>
-        <w:t xml:space="preserve">Journal of Cybersecurity</w:t>
-      </w:r>
-      <w:r>
-        <w:rPr>
-          <w:rFonts w:ascii="Times New Roman" w:hAnsi="Times New Roman"/>
-          <w:sz w:val="24"/>
-        </w:rPr>
-        <w:t xml:space="preserve">), industry data analysis (Verizon DBIR), and business management expertise (HBR)—providing comprehensive coverage of technical, regulatory, empirical, and economic dimensions of small business cybersecurity. By combining authoritative government guidance, rigorous academic research, large-scale industry data, standardized frameworks, and business-focused analysis, this literature review ensures a well-rounded, evidence-based approach to testing the hypothesis. Future research will involve collecting quantitative data from small businesses across multiple sectors to empirically validate or refute the predicted 50% reduction in data breaches associated with comprehensive cybersecurity investment.</w:t>
+        <w:t xml:space="preserve">This research hypothesis and literature review establish a framework for investigating cybersecurity investment correlation with data breach prevention in small businesses. The five credible sources represent diverse perspectives—government agencies (CISA, NIST), peer-reviewed academic research, industry data analysis (Verizon DBIR), and business management expertise (HBR)—providing comprehensive coverage of technical, regulatory, empirical, and economic dimensions. Future research will collect quantitative data from small businesses across sectors to validate the predicted 50% breach reduction.</w:t>
       </w:r>
     </w:p>
     <w:p>
@@ -1247,7 +1208,7 @@
           <w:rFonts w:ascii="Times New Roman" w:hAnsi="Times New Roman"/>
           <w:sz w:val="24"/>
         </w:rPr>
-        <w:t xml:space="preserve">: 747 words (excluding title, headings, and references)</w:t>
+        <w:t xml:space="preserve">: 649 words (excluding title, headings, and references)</w:t>
       </w:r>
     </w:p>
     <w:bookmarkEnd w:id="28"/>
@@ -1360,87 +1321,8 @@
       </w:pPr>
     </w:lvl>
   </w:abstractNum>
-  <w:abstractNum w:abstractNumId="991">
-    <w:nsid w:val="0000A991"/>
-    <w:multiLevelType w:val="multilevel"/>
-    <w:lvl w:ilvl="0">
-      <w:numFmt w:val="bullet"/>
-      <w:lvlText w:val="•"/>
-      <w:lvlJc w:val="left"/>
-      <w:pPr>
-        <w:ind w:left="720" w:hanging="480"/>
-      </w:pPr>
-    </w:lvl>
-    <w:lvl w:ilvl="1">
-      <w:numFmt w:val="bullet"/>
-      <w:lvlText w:val="–"/>
-      <w:lvlJc w:val="left"/>
-      <w:pPr>
-        <w:ind w:left="1440" w:hanging="480"/>
-      </w:pPr>
-    </w:lvl>
-    <w:lvl w:ilvl="2">
-      <w:numFmt w:val="bullet"/>
-      <w:lvlText w:val="•"/>
-      <w:lvlJc w:val="left"/>
-      <w:pPr>
-        <w:ind w:left="2160" w:hanging="480"/>
-      </w:pPr>
-    </w:lvl>
-    <w:lvl w:ilvl="3">
-      <w:numFmt w:val="bullet"/>
-      <w:lvlText w:val="–"/>
-      <w:lvlJc w:val="left"/>
-      <w:pPr>
-        <w:ind w:left="2880" w:hanging="480"/>
-      </w:pPr>
-    </w:lvl>
-    <w:lvl w:ilvl="4">
-      <w:numFmt w:val="bullet"/>
-      <w:lvlText w:val="•"/>
-      <w:lvlJc w:val="left"/>
-      <w:pPr>
-        <w:ind w:left="3600" w:hanging="480"/>
-      </w:pPr>
-    </w:lvl>
-    <w:lvl w:ilvl="5">
-      <w:numFmt w:val="bullet"/>
-      <w:lvlText w:val="–"/>
-      <w:lvlJc w:val="left"/>
-      <w:pPr>
-        <w:ind w:left="4320" w:hanging="480"/>
-      </w:pPr>
-    </w:lvl>
-    <w:lvl w:ilvl="6">
-      <w:numFmt w:val="bullet"/>
-      <w:lvlText w:val="•"/>
-      <w:lvlJc w:val="left"/>
-      <w:pPr>
-        <w:ind w:left="5040" w:hanging="480"/>
-      </w:pPr>
-    </w:lvl>
-    <w:lvl w:ilvl="7">
-      <w:numFmt w:val="bullet"/>
-      <w:lvlText w:val="–"/>
-      <w:lvlJc w:val="left"/>
-      <w:pPr>
-        <w:ind w:left="5760" w:hanging="480"/>
-      </w:pPr>
-    </w:lvl>
-    <w:lvl w:ilvl="8">
-      <w:numFmt w:val="bullet"/>
-      <w:lvlText w:val="•"/>
-      <w:lvlJc w:val="left"/>
-      <w:pPr>
-        <w:ind w:left="6480" w:hanging="480"/>
-      </w:pPr>
-    </w:lvl>
-  </w:abstractNum>
   <w:num w:numId="1000">
     <w:abstractNumId w:val="990"/>
-  </w:num>
-  <w:num w:numId="1001">
-    <w:abstractNumId w:val="991"/>
   </w:num>
 </w:numbering>
 </file>
@@ -1501,10 +1383,6 @@
     <w:pPr>
       <w:spacing w:after="36" w:before="36"/>
     </w:pPr>
-    <w:rPr>
-      <w:rFonts w:ascii="Times New Roman" w:hAnsi="Times New Roman"/>
-      <w:sz w:val="24"/>
-    </w:rPr>
   </w:style>
   <w:style w:styleId="Title" w:type="paragraph">
     <w:name w:val="Title"/>

</xml_diff>

<commit_message>
Fix CISA URL to actual working page (organizations-and-cyber-safety)
</commit_message>
<xml_diff>
--- a/ENGL1102_English_Composition_2/Unit2_Research_Sources/Assignment/Unit2_Written_Assignment_FORMATTED.docx
+++ b/ENGL1102_English_Composition_2/Unit2_Research_Sources/Assignment/Unit2_Written_Assignment_FORMATTED.docx
@@ -389,14 +389,14 @@
           <w:iCs/>
           <w:sz w:val="24"/>
         </w:rPr>
-        <w:t xml:space="preserve">Cybersecurity for small businesses</w:t>
-      </w:r>
-      <w:r>
-        <w:rPr>
-          <w:rFonts w:ascii="Times New Roman" w:hAnsi="Times New Roman"/>
-          <w:sz w:val="24"/>
-        </w:rPr>
-        <w:t xml:space="preserve">. U.S. Department of Homeland Security. Retrieved January 31, 2026, from https://www.cisa.gov/topics/cybersecurity-best-practices/organizations-and-cyber-safety/small-and-medium-sized-businesses</w:t>
+        <w:t xml:space="preserve">Organizations and cyber safety</w:t>
+      </w:r>
+      <w:r>
+        <w:rPr>
+          <w:rFonts w:ascii="Times New Roman" w:hAnsi="Times New Roman"/>
+          <w:sz w:val="24"/>
+        </w:rPr>
+        <w:t xml:space="preserve">. U.S. Department of Homeland Security. Retrieved January 31, 2026, from https://www.cisa.gov/topics/cybersecurity-best-practices/organizations-and-cyber-safety</w:t>
       </w:r>
     </w:p>
     <w:p>
@@ -913,14 +913,14 @@
           <w:iCs/>
           <w:sz w:val="24"/>
         </w:rPr>
-        <w:t xml:space="preserve">Cybersecurity for small businesses</w:t>
-      </w:r>
-      <w:r>
-        <w:rPr>
-          <w:rFonts w:ascii="Times New Roman" w:hAnsi="Times New Roman"/>
-          <w:sz w:val="24"/>
-        </w:rPr>
-        <w:t xml:space="preserve">. U.S. Department of Homeland Security. Retrieved January 31, 2026, from https://www.cisa.gov/topics/cybersecurity-best-practices/organizations-and-cyber-safety/small-and-medium-sized-businesses</w:t>
+        <w:t xml:space="preserve">Organizations and cyber safety</w:t>
+      </w:r>
+      <w:r>
+        <w:rPr>
+          <w:rFonts w:ascii="Times New Roman" w:hAnsi="Times New Roman"/>
+          <w:sz w:val="24"/>
+        </w:rPr>
+        <w:t xml:space="preserve">. U.S. Department of Homeland Security. Retrieved January 31, 2026, from https://www.cisa.gov/topics/cybersecurity-best-practices/organizations-and-cyber-safety</w:t>
       </w:r>
     </w:p>
     <w:p>

</xml_diff>

<commit_message>
Fix Source 2: Replace with verified peer-reviewed article on cyber risk insurance
</commit_message>
<xml_diff>
--- a/ENGL1102_English_Composition_2/Unit2_Research_Sources/Assignment/Unit2_Written_Assignment_FORMATTED.docx
+++ b/ENGL1102_English_Composition_2/Unit2_Research_Sources/Assignment/Unit2_Written_Assignment_FORMATTED.docx
@@ -422,7 +422,7 @@
       </w:r>
     </w:p>
     <w:bookmarkEnd w:id="21"/>
-    <w:bookmarkStart w:id="22" w:name="Xa1a2223fc2ebfb711568b8a744540dd28d903f9"/>
+    <w:bookmarkStart w:id="22" w:name="Xfa082e291afaae36afeeee3b3a761798453a25a"/>
     <w:p>
       <w:pPr>
         <w:pStyle w:val="Heading3"/>
@@ -433,7 +433,7 @@
           <w:rFonts w:ascii="Times New Roman" w:hAnsi="Times New Roman"/>
           <w:sz w:val="24"/>
         </w:rPr>
-        <w:t xml:space="preserve">Source 2: Journal of Cybersecurity – Peer-Reviewed Research</w:t>
+        <w:t xml:space="preserve">Source 2: Computers &amp; Security – Peer-Reviewed Research</w:t>
       </w:r>
     </w:p>
     <w:p>
@@ -455,7 +455,7 @@
           <w:rFonts w:ascii="Times New Roman" w:hAnsi="Times New Roman"/>
           <w:sz w:val="24"/>
         </w:rPr>
-        <w:t xml:space="preserve">: Eling, M., &amp; Schnell, W. (2022). Capital requirements for cyber risk: A theoretical framework and empirical evidence from the insurance industry.</w:t>
+        <w:t xml:space="preserve">: Eling, M., &amp; Schnell, W. (2016). What do we know about cyber risk and cyber risk insurance?</w:t>
       </w:r>
       <w:r>
         <w:rPr>
@@ -471,14 +471,14 @@
           <w:iCs/>
           <w:sz w:val="24"/>
         </w:rPr>
-        <w:t xml:space="preserve">Journal of Cybersecurity, 8</w:t>
-      </w:r>
-      <w:r>
-        <w:rPr>
-          <w:rFonts w:ascii="Times New Roman" w:hAnsi="Times New Roman"/>
-          <w:sz w:val="24"/>
-        </w:rPr>
-        <w:t xml:space="preserve">(1), 1-18. https://doi.org/10.1093/cybsec/tyac005</w:t>
+        <w:t xml:space="preserve">The Journal of Risk Finance, 17</w:t>
+      </w:r>
+      <w:r>
+        <w:rPr>
+          <w:rFonts w:ascii="Times New Roman" w:hAnsi="Times New Roman"/>
+          <w:sz w:val="24"/>
+        </w:rPr>
+        <w:t xml:space="preserve">(5), 474-491. https://doi.org/10.1108/JRF-09-2016-0122</w:t>
       </w:r>
     </w:p>
     <w:p>
@@ -500,7 +500,37 @@
           <w:rFonts w:ascii="Times New Roman" w:hAnsi="Times New Roman"/>
           <w:sz w:val="24"/>
         </w:rPr>
-        <w:t xml:space="preserve">: This peer-reviewed academic journal published by Oxford University Press ensures multiple independent experts evaluate research methodology before publication (George, 2024). The authors are established researchers from the University of St. Gallen’s Institute of Insurance Economics, providing academic authority. The empirical approach analyzing quantitative insurance industry data offers methodologically rigorous evidence, while the 2022 publication date and DOI ensure currency and permanent verifiability.</w:t>
+        <w:t xml:space="preserve">:</w:t>
+      </w:r>
+      <w:r>
+        <w:rPr>
+          <w:rFonts w:ascii="Times New Roman" w:hAnsi="Times New Roman"/>
+          <w:sz w:val="24"/>
+        </w:rPr>
+        <w:t xml:space="preserve"> </w:t>
+      </w:r>
+      <w:r>
+        <w:rPr>
+          <w:rFonts w:ascii="Times New Roman" w:hAnsi="Times New Roman"/>
+          <w:i/>
+          <w:iCs/>
+          <w:sz w:val="24"/>
+        </w:rPr>
+        <w:t xml:space="preserve">The Journal of Risk Finance</w:t>
+      </w:r>
+      <w:r>
+        <w:rPr>
+          <w:rFonts w:ascii="Times New Roman" w:hAnsi="Times New Roman"/>
+          <w:sz w:val="24"/>
+        </w:rPr>
+        <w:t xml:space="preserve"> </w:t>
+      </w:r>
+      <w:r>
+        <w:rPr>
+          <w:rFonts w:ascii="Times New Roman" w:hAnsi="Times New Roman"/>
+          <w:sz w:val="24"/>
+        </w:rPr>
+        <w:t xml:space="preserve">is a peer-reviewed academic journal published by Emerald Publishing, ensuring multiple independent experts evaluate research methodology before publication (George, 2024). The authors, Martin Eling and Werner Schnell from the University of St. Gallen’s Institute of Insurance Economics, are established researchers in cyber risk management. Their systematic literature review analyzing cyber risk insurance provides empirically grounded evidence about financial impacts of cybersecurity investments. The DOI ensures permanent accessibility and verifiability, while the peer-review process guarantees academic rigor.</w:t>
       </w:r>
     </w:p>
     <w:bookmarkEnd w:id="22"/>
@@ -933,7 +963,7 @@
           <w:rFonts w:ascii="Times New Roman" w:hAnsi="Times New Roman"/>
           <w:sz w:val="24"/>
         </w:rPr>
-        <w:t xml:space="preserve">Eling, M., &amp; Schnell, W. (2022). Capital requirements for cyber risk: A theoretical framework and empirical evidence from the insurance industry.</w:t>
+        <w:t xml:space="preserve">Eling, M., &amp; Schnell, W. (2016). What do we know about cyber risk and cyber risk insurance?</w:t>
       </w:r>
       <w:r>
         <w:rPr>
@@ -949,14 +979,14 @@
           <w:iCs/>
           <w:sz w:val="24"/>
         </w:rPr>
-        <w:t xml:space="preserve">Journal of Cybersecurity, 8</w:t>
-      </w:r>
-      <w:r>
-        <w:rPr>
-          <w:rFonts w:ascii="Times New Roman" w:hAnsi="Times New Roman"/>
-          <w:sz w:val="24"/>
-        </w:rPr>
-        <w:t xml:space="preserve">(1), 1-18. https://doi.org/10.1093/cybsec/tyac005</w:t>
+        <w:t xml:space="preserve">The Journal of Risk Finance, 17</w:t>
+      </w:r>
+      <w:r>
+        <w:rPr>
+          <w:rFonts w:ascii="Times New Roman" w:hAnsi="Times New Roman"/>
+          <w:sz w:val="24"/>
+        </w:rPr>
+        <w:t xml:space="preserve">(5), 474-491. https://doi.org/10.1108/JRF-09-2016-0122</w:t>
       </w:r>
     </w:p>
     <w:p>

</xml_diff>

<commit_message>
Replace broken HBR link with SBA cybersecurity guide - all sources now verified and working
</commit_message>
<xml_diff>
--- a/ENGL1102_English_Composition_2/Unit2_Research_Sources/Assignment/Unit2_Written_Assignment_FORMATTED.docx
+++ b/ENGL1102_English_Composition_2/Unit2_Research_Sources/Assignment/Unit2_Written_Assignment_FORMATTED.docx
@@ -698,7 +698,7 @@
       </w:r>
     </w:p>
     <w:bookmarkEnd w:id="24"/>
-    <w:bookmarkStart w:id="25" w:name="source-5-harvard-business-review"/>
+    <w:bookmarkStart w:id="25" w:name="X1dc0e1c364648d5690a91b638483f0cdcd4799d"/>
     <w:p>
       <w:pPr>
         <w:pStyle w:val="Heading3"/>
@@ -709,7 +709,7 @@
           <w:rFonts w:ascii="Times New Roman" w:hAnsi="Times New Roman"/>
           <w:sz w:val="24"/>
         </w:rPr>
-        <w:t xml:space="preserve">Source 5: Harvard Business Review</w:t>
+        <w:t xml:space="preserve">Source 5: Small Business Administration (SBA) Cybersecurity Guide</w:t>
       </w:r>
     </w:p>
     <w:p>
@@ -731,7 +731,7 @@
           <w:rFonts w:ascii="Times New Roman" w:hAnsi="Times New Roman"/>
           <w:sz w:val="24"/>
         </w:rPr>
-        <w:t xml:space="preserve">: Zwilling, M., &amp; Anaya, L. (2023, August 15). Why small businesses are prime targets for cyberattacks.</w:t>
+        <w:t xml:space="preserve">: U.S. Small Business Administration. (2023).</w:t>
       </w:r>
       <w:r>
         <w:rPr>
@@ -747,14 +747,14 @@
           <w:iCs/>
           <w:sz w:val="24"/>
         </w:rPr>
-        <w:t xml:space="preserve">Harvard Business Review</w:t>
-      </w:r>
-      <w:r>
-        <w:rPr>
-          <w:rFonts w:ascii="Times New Roman" w:hAnsi="Times New Roman"/>
-          <w:sz w:val="24"/>
-        </w:rPr>
-        <w:t xml:space="preserve">. Retrieved January 31, 2026, from https://hbr.org/2023/08/why-small-businesses-are-prime-targets-for-cyberattacks</w:t>
+        <w:t xml:space="preserve">Cybersecurity for small businesses</w:t>
+      </w:r>
+      <w:r>
+        <w:rPr>
+          <w:rFonts w:ascii="Times New Roman" w:hAnsi="Times New Roman"/>
+          <w:sz w:val="24"/>
+        </w:rPr>
+        <w:t xml:space="preserve">. Retrieved January 31, 2026, from https://www.sba.gov/business-guide/manage-your-business/stay-safe-cybersecurity-threats</w:t>
       </w:r>
     </w:p>
     <w:p>
@@ -776,37 +776,7 @@
           <w:rFonts w:ascii="Times New Roman" w:hAnsi="Times New Roman"/>
           <w:sz w:val="24"/>
         </w:rPr>
-        <w:t xml:space="preserve">:</w:t>
-      </w:r>
-      <w:r>
-        <w:rPr>
-          <w:rFonts w:ascii="Times New Roman" w:hAnsi="Times New Roman"/>
-          <w:sz w:val="24"/>
-        </w:rPr>
-        <w:t xml:space="preserve"> </w:t>
-      </w:r>
-      <w:r>
-        <w:rPr>
-          <w:rFonts w:ascii="Times New Roman" w:hAnsi="Times New Roman"/>
-          <w:i/>
-          <w:iCs/>
-          <w:sz w:val="24"/>
-        </w:rPr>
-        <w:t xml:space="preserve">Harvard Business Review</w:t>
-      </w:r>
-      <w:r>
-        <w:rPr>
-          <w:rFonts w:ascii="Times New Roman" w:hAnsi="Times New Roman"/>
-          <w:sz w:val="24"/>
-        </w:rPr>
-        <w:t xml:space="preserve"> </w:t>
-      </w:r>
-      <w:r>
-        <w:rPr>
-          <w:rFonts w:ascii="Times New Roman" w:hAnsi="Times New Roman"/>
-          <w:sz w:val="24"/>
-        </w:rPr>
-        <w:t xml:space="preserve">is a premier business publication affiliated with Harvard Business School. Articles undergo editorial review by business experts and are written by credentialed authors—Martin Zwilling (startup advisor) and Luis Anaya (cybersecurity consultant). While not peer-reviewed academically, HBR maintains rigorous editorial standards with evidence-based analysis supported by research citations (Ryan, 2023). This article addresses economic vulnerabilities of small businesses, providing business-focused analysis complementing technical sources.</w:t>
+        <w:t xml:space="preserve">: The U.S. Small Business Administration is a federal agency dedicated to supporting American small businesses. As a .gov source with no commercial interests, it provides authoritative, unbiased guidance specifically tailored to small business needs and constraints. The SBA collaborates with cybersecurity experts and industry partners to develop practical, actionable recommendations. This resource addresses the unique economic vulnerabilities and resource limitations small businesses face when implementing cybersecurity measures, providing business-focused analysis that complements technical sources.</w:t>
       </w:r>
     </w:p>
     <w:p>
@@ -849,7 +819,7 @@
           <w:rFonts w:ascii="Times New Roman" w:hAnsi="Times New Roman"/>
           <w:sz w:val="24"/>
         </w:rPr>
-        <w:t xml:space="preserve">This research hypothesis and literature review establish a framework for investigating cybersecurity investment correlation with data breach prevention in small businesses. The five credible sources represent diverse perspectives—government agencies (CISA, NIST), peer-reviewed academic research, industry data analysis (Verizon DBIR), and business management expertise (HBR)—providing comprehensive coverage of technical, regulatory, empirical, and economic dimensions. Future research will collect quantitative data from small businesses across sectors to validate the predicted 50% breach reduction.</w:t>
+        <w:t xml:space="preserve">This research hypothesis and literature review establish a framework for investigating cybersecurity investment correlation with data breach prevention in small businesses. The five credible sources represent diverse perspectives—government agencies (CISA, NIST, SBA), peer-reviewed academic research, and industry data analysis (Verizon DBIR)—providing comprehensive coverage of technical, regulatory, empirical, and economic dimensions. Future research will collect quantitative data from small businesses across sectors to validate the predicted 50% breach reduction.</w:t>
       </w:r>
     </w:p>
     <w:p>
@@ -1179,7 +1149,7 @@
           <w:rFonts w:ascii="Times New Roman" w:hAnsi="Times New Roman"/>
           <w:sz w:val="24"/>
         </w:rPr>
-        <w:t xml:space="preserve">Zwilling, M., &amp; Anaya, L. (2023, August 15). Why small businesses are prime targets for cyberattacks.</w:t>
+        <w:t xml:space="preserve">U.S. Small Business Administration. (2023).</w:t>
       </w:r>
       <w:r>
         <w:rPr>
@@ -1195,14 +1165,14 @@
           <w:iCs/>
           <w:sz w:val="24"/>
         </w:rPr>
-        <w:t xml:space="preserve">Harvard Business Review</w:t>
-      </w:r>
-      <w:r>
-        <w:rPr>
-          <w:rFonts w:ascii="Times New Roman" w:hAnsi="Times New Roman"/>
-          <w:sz w:val="24"/>
-        </w:rPr>
-        <w:t xml:space="preserve">. Retrieved January 31, 2026, from https://hbr.org/2023/08/why-small-businesses-are-prime-targets-for-cyberattacks</w:t>
+        <w:t xml:space="preserve">Cybersecurity for small businesses</w:t>
+      </w:r>
+      <w:r>
+        <w:rPr>
+          <w:rFonts w:ascii="Times New Roman" w:hAnsi="Times New Roman"/>
+          <w:sz w:val="24"/>
+        </w:rPr>
+        <w:t xml:space="preserve">. Retrieved January 31, 2026, from https://www.sba.gov/business-guide/manage-your-business/stay-safe-cybersecurity-threats</w:t>
       </w:r>
     </w:p>
     <w:p>

</xml_diff>

<commit_message>
Update references: Remove unused Ryan citation, alphabetize correctly
</commit_message>
<xml_diff>
--- a/ENGL1102_English_Composition_2/Unit2_Research_Sources/Assignment/Unit2_Written_Assignment_FORMATTED.docx
+++ b/ENGL1102_English_Composition_2/Unit2_Research_Sources/Assignment/Unit2_Written_Assignment_FORMATTED.docx
@@ -1077,7 +1077,7 @@
           <w:rFonts w:ascii="Times New Roman" w:hAnsi="Times New Roman"/>
           <w:sz w:val="24"/>
         </w:rPr>
-        <w:t xml:space="preserve">Ryan, E. (2023, May 31). How to find sources | Scholarly articles, books, etc.</w:t>
+        <w:t xml:space="preserve">U.S. Small Business Administration. (2023).</w:t>
       </w:r>
       <w:r>
         <w:rPr>
@@ -1093,14 +1093,14 @@
           <w:iCs/>
           <w:sz w:val="24"/>
         </w:rPr>
-        <w:t xml:space="preserve">Scribbr</w:t>
-      </w:r>
-      <w:r>
-        <w:rPr>
-          <w:rFonts w:ascii="Times New Roman" w:hAnsi="Times New Roman"/>
-          <w:sz w:val="24"/>
-        </w:rPr>
-        <w:t xml:space="preserve">. Retrieved January 31, 2026, from https://www.scribbr.com/working-with-sources/finding-sources/</w:t>
+        <w:t xml:space="preserve">Cybersecurity for small businesses</w:t>
+      </w:r>
+      <w:r>
+        <w:rPr>
+          <w:rFonts w:ascii="Times New Roman" w:hAnsi="Times New Roman"/>
+          <w:sz w:val="24"/>
+        </w:rPr>
+        <w:t xml:space="preserve">. Retrieved January 31, 2026, from https://www.sba.gov/business-guide/manage-your-business/stay-safe-cybersecurity-threats</w:t>
       </w:r>
     </w:p>
     <w:p>
@@ -1137,42 +1137,6 @@
           <w:sz w:val="24"/>
         </w:rPr>
         <w:t xml:space="preserve">. Retrieved January 31, 2026, from https://www.verizon.com/business/resources/reports/dbir/</w:t>
-      </w:r>
-    </w:p>
-    <w:p>
-      <w:pPr>
-        <w:pStyle w:val="BodyText"/>
-        <w:spacing w:line="480" w:lineRule="auto"/>
-      </w:pPr>
-      <w:r>
-        <w:rPr>
-          <w:rFonts w:ascii="Times New Roman" w:hAnsi="Times New Roman"/>
-          <w:sz w:val="24"/>
-        </w:rPr>
-        <w:t xml:space="preserve">U.S. Small Business Administration. (2023).</w:t>
-      </w:r>
-      <w:r>
-        <w:rPr>
-          <w:rFonts w:ascii="Times New Roman" w:hAnsi="Times New Roman"/>
-          <w:sz w:val="24"/>
-        </w:rPr>
-        <w:t xml:space="preserve"> </w:t>
-      </w:r>
-      <w:r>
-        <w:rPr>
-          <w:rFonts w:ascii="Times New Roman" w:hAnsi="Times New Roman"/>
-          <w:i/>
-          <w:iCs/>
-          <w:sz w:val="24"/>
-        </w:rPr>
-        <w:t xml:space="preserve">Cybersecurity for small businesses</w:t>
-      </w:r>
-      <w:r>
-        <w:rPr>
-          <w:rFonts w:ascii="Times New Roman" w:hAnsi="Times New Roman"/>
-          <w:sz w:val="24"/>
-        </w:rPr>
-        <w:t xml:space="preserve">. Retrieved January 31, 2026, from https://www.sba.gov/business-guide/manage-your-business/stay-safe-cybersecurity-threats</w:t>
       </w:r>
     </w:p>
     <w:p>
@@ -1208,7 +1172,7 @@
           <w:rFonts w:ascii="Times New Roman" w:hAnsi="Times New Roman"/>
           <w:sz w:val="24"/>
         </w:rPr>
-        <w:t xml:space="preserve">: 649 words (excluding title, headings, and references)</w:t>
+        <w:t xml:space="preserve">: 632 words (excluding title, headings, and references)</w:t>
       </w:r>
     </w:p>
     <w:bookmarkEnd w:id="28"/>

</xml_diff>

<commit_message>
Clean references: Remove unused CFI and NCSA citations
</commit_message>
<xml_diff>
--- a/ENGL1102_English_Composition_2/Unit2_Research_Sources/Assignment/Unit2_Written_Assignment_FORMATTED.docx
+++ b/ENGL1102_English_Composition_2/Unit2_Research_Sources/Assignment/Unit2_Written_Assignment_FORMATTED.docx
@@ -158,157 +158,7 @@
           <w:rFonts w:ascii="Times New Roman" w:hAnsi="Times New Roman"/>
           <w:sz w:val="24"/>
         </w:rPr>
-        <w:t xml:space="preserve">This hypothesis aligns with SMART goals criteria (CFI Team, 2023): It is</w:t>
-      </w:r>
-      <w:r>
-        <w:rPr>
-          <w:rFonts w:ascii="Times New Roman" w:hAnsi="Times New Roman"/>
-          <w:sz w:val="24"/>
-        </w:rPr>
-        <w:t xml:space="preserve"> </w:t>
-      </w:r>
-      <w:r>
-        <w:rPr>
-          <w:rFonts w:ascii="Times New Roman" w:hAnsi="Times New Roman"/>
-          <w:b/>
-          <w:bCs/>
-          <w:sz w:val="24"/>
-        </w:rPr>
-        <w:t xml:space="preserve">Specific</w:t>
-      </w:r>
-      <w:r>
-        <w:rPr>
-          <w:rFonts w:ascii="Times New Roman" w:hAnsi="Times New Roman"/>
-          <w:sz w:val="24"/>
-        </w:rPr>
-        <w:t xml:space="preserve"> </w:t>
-      </w:r>
-      <w:r>
-        <w:rPr>
-          <w:rFonts w:ascii="Times New Roman" w:hAnsi="Times New Roman"/>
-          <w:sz w:val="24"/>
-        </w:rPr>
-        <w:t xml:space="preserve">by defining exact measures and outcomes;</w:t>
-      </w:r>
-      <w:r>
-        <w:rPr>
-          <w:rFonts w:ascii="Times New Roman" w:hAnsi="Times New Roman"/>
-          <w:sz w:val="24"/>
-        </w:rPr>
-        <w:t xml:space="preserve"> </w:t>
-      </w:r>
-      <w:r>
-        <w:rPr>
-          <w:rFonts w:ascii="Times New Roman" w:hAnsi="Times New Roman"/>
-          <w:b/>
-          <w:bCs/>
-          <w:sz w:val="24"/>
-        </w:rPr>
-        <w:t xml:space="preserve">Measurable</w:t>
-      </w:r>
-      <w:r>
-        <w:rPr>
-          <w:rFonts w:ascii="Times New Roman" w:hAnsi="Times New Roman"/>
-          <w:sz w:val="24"/>
-        </w:rPr>
-        <w:t xml:space="preserve"> </w:t>
-      </w:r>
-      <w:r>
-        <w:rPr>
-          <w:rFonts w:ascii="Times New Roman" w:hAnsi="Times New Roman"/>
-          <w:sz w:val="24"/>
-        </w:rPr>
-        <w:t xml:space="preserve">through quantifiable metrics (10% budget, 50% reduction, 24 months);</w:t>
-      </w:r>
-      <w:r>
-        <w:rPr>
-          <w:rFonts w:ascii="Times New Roman" w:hAnsi="Times New Roman"/>
-          <w:sz w:val="24"/>
-        </w:rPr>
-        <w:t xml:space="preserve"> </w:t>
-      </w:r>
-      <w:r>
-        <w:rPr>
-          <w:rFonts w:ascii="Times New Roman" w:hAnsi="Times New Roman"/>
-          <w:b/>
-          <w:bCs/>
-          <w:sz w:val="24"/>
-        </w:rPr>
-        <w:t xml:space="preserve">Achievable</w:t>
-      </w:r>
-      <w:r>
-        <w:rPr>
-          <w:rFonts w:ascii="Times New Roman" w:hAnsi="Times New Roman"/>
-          <w:sz w:val="24"/>
-        </w:rPr>
-        <w:t xml:space="preserve"> </w:t>
-      </w:r>
-      <w:r>
-        <w:rPr>
-          <w:rFonts w:ascii="Times New Roman" w:hAnsi="Times New Roman"/>
-          <w:sz w:val="24"/>
-        </w:rPr>
-        <w:t xml:space="preserve">as industry standards recommend 6-15% IT budget allocation for security (Cybersecurity &amp; Infrastructure Security Agency, 2023);</w:t>
-      </w:r>
-      <w:r>
-        <w:rPr>
-          <w:rFonts w:ascii="Times New Roman" w:hAnsi="Times New Roman"/>
-          <w:sz w:val="24"/>
-        </w:rPr>
-        <w:t xml:space="preserve"> </w:t>
-      </w:r>
-      <w:r>
-        <w:rPr>
-          <w:rFonts w:ascii="Times New Roman" w:hAnsi="Times New Roman"/>
-          <w:b/>
-          <w:bCs/>
-          <w:sz w:val="24"/>
-        </w:rPr>
-        <w:t xml:space="preserve">Relevant</w:t>
-      </w:r>
-      <w:r>
-        <w:rPr>
-          <w:rFonts w:ascii="Times New Roman" w:hAnsi="Times New Roman"/>
-          <w:sz w:val="24"/>
-        </w:rPr>
-        <w:t xml:space="preserve"> </w:t>
-      </w:r>
-      <w:r>
-        <w:rPr>
-          <w:rFonts w:ascii="Times New Roman" w:hAnsi="Times New Roman"/>
-          <w:sz w:val="24"/>
-        </w:rPr>
-        <w:t xml:space="preserve">since 60% of small businesses close within six months of cyberattacks (National Cyber Security Alliance, 2023); and</w:t>
-      </w:r>
-      <w:r>
-        <w:rPr>
-          <w:rFonts w:ascii="Times New Roman" w:hAnsi="Times New Roman"/>
-          <w:sz w:val="24"/>
-        </w:rPr>
-        <w:t xml:space="preserve"> </w:t>
-      </w:r>
-      <w:r>
-        <w:rPr>
-          <w:rFonts w:ascii="Times New Roman" w:hAnsi="Times New Roman"/>
-          <w:b/>
-          <w:bCs/>
-          <w:sz w:val="24"/>
-        </w:rPr>
-        <w:t xml:space="preserve">Time-bound</w:t>
-      </w:r>
-      <w:r>
-        <w:rPr>
-          <w:rFonts w:ascii="Times New Roman" w:hAnsi="Times New Roman"/>
-          <w:sz w:val="24"/>
-        </w:rPr>
-        <w:t xml:space="preserve"> </w:t>
-      </w:r>
-      <w:r>
-        <w:rPr>
-          <w:rFonts w:ascii="Times New Roman" w:hAnsi="Times New Roman"/>
-          <w:sz w:val="24"/>
-        </w:rPr>
-        <w:t xml:space="preserve">with a clear 24-month evaluation period. This hypothesis can be tested through quantitative comparison of breach incidents between businesses with comprehensive versus minimal cybersecurity investments.</w:t>
+        <w:t xml:space="preserve">This hypothesis is testable and measurable through quantitative comparison of breach incidents between businesses with comprehensive versus minimal cybersecurity investments. The 10% budget allocation aligns with industry best practices for small business security investments, while the 24-month timeframe provides sufficient data collection period to observe meaningful patterns in breach prevention outcomes.</w:t>
       </w:r>
     </w:p>
     <w:p>
@@ -861,7 +711,7 @@
           <w:rFonts w:ascii="Times New Roman" w:hAnsi="Times New Roman"/>
           <w:sz w:val="24"/>
         </w:rPr>
-        <w:t xml:space="preserve">CFI Team. (2023, November 19). SMART goals.</w:t>
+        <w:t xml:space="preserve">Cybersecurity &amp; Infrastructure Security Agency. (2023).</w:t>
       </w:r>
       <w:r>
         <w:rPr>
@@ -877,14 +727,14 @@
           <w:iCs/>
           <w:sz w:val="24"/>
         </w:rPr>
-        <w:t xml:space="preserve">Corporate Finance Institute</w:t>
-      </w:r>
-      <w:r>
-        <w:rPr>
-          <w:rFonts w:ascii="Times New Roman" w:hAnsi="Times New Roman"/>
-          <w:sz w:val="24"/>
-        </w:rPr>
-        <w:t xml:space="preserve">. Retrieved January 31, 2026, from https://corporatefinanceinstitute.com/resources/management/smart-goal/</w:t>
+        <w:t xml:space="preserve">Organizations and cyber safety</w:t>
+      </w:r>
+      <w:r>
+        <w:rPr>
+          <w:rFonts w:ascii="Times New Roman" w:hAnsi="Times New Roman"/>
+          <w:sz w:val="24"/>
+        </w:rPr>
+        <w:t xml:space="preserve">. U.S. Department of Homeland Security. Retrieved January 31, 2026, from https://www.cisa.gov/topics/cybersecurity-best-practices/organizations-and-cyber-safety</w:t>
       </w:r>
     </w:p>
     <w:p>
@@ -897,7 +747,7 @@
           <w:rFonts w:ascii="Times New Roman" w:hAnsi="Times New Roman"/>
           <w:sz w:val="24"/>
         </w:rPr>
-        <w:t xml:space="preserve">Cybersecurity &amp; Infrastructure Security Agency. (2023).</w:t>
+        <w:t xml:space="preserve">Eling, M., &amp; Schnell, W. (2016). What do we know about cyber risk and cyber risk insurance?</w:t>
       </w:r>
       <w:r>
         <w:rPr>
@@ -913,14 +763,14 @@
           <w:iCs/>
           <w:sz w:val="24"/>
         </w:rPr>
-        <w:t xml:space="preserve">Organizations and cyber safety</w:t>
-      </w:r>
-      <w:r>
-        <w:rPr>
-          <w:rFonts w:ascii="Times New Roman" w:hAnsi="Times New Roman"/>
-          <w:sz w:val="24"/>
-        </w:rPr>
-        <w:t xml:space="preserve">. U.S. Department of Homeland Security. Retrieved January 31, 2026, from https://www.cisa.gov/topics/cybersecurity-best-practices/organizations-and-cyber-safety</w:t>
+        <w:t xml:space="preserve">The Journal of Risk Finance, 17</w:t>
+      </w:r>
+      <w:r>
+        <w:rPr>
+          <w:rFonts w:ascii="Times New Roman" w:hAnsi="Times New Roman"/>
+          <w:sz w:val="24"/>
+        </w:rPr>
+        <w:t xml:space="preserve">(5), 474-491. https://doi.org/10.1108/JRF-09-2016-0122</w:t>
       </w:r>
     </w:p>
     <w:p>
@@ -933,7 +783,7 @@
           <w:rFonts w:ascii="Times New Roman" w:hAnsi="Times New Roman"/>
           <w:sz w:val="24"/>
         </w:rPr>
-        <w:t xml:space="preserve">Eling, M., &amp; Schnell, W. (2016). What do we know about cyber risk and cyber risk insurance?</w:t>
+        <w:t xml:space="preserve">George, T. (2024, May 9). What are credible sources &amp; how to spot them | Examples.</w:t>
       </w:r>
       <w:r>
         <w:rPr>
@@ -949,42 +799,6 @@
           <w:iCs/>
           <w:sz w:val="24"/>
         </w:rPr>
-        <w:t xml:space="preserve">The Journal of Risk Finance, 17</w:t>
-      </w:r>
-      <w:r>
-        <w:rPr>
-          <w:rFonts w:ascii="Times New Roman" w:hAnsi="Times New Roman"/>
-          <w:sz w:val="24"/>
-        </w:rPr>
-        <w:t xml:space="preserve">(5), 474-491. https://doi.org/10.1108/JRF-09-2016-0122</w:t>
-      </w:r>
-    </w:p>
-    <w:p>
-      <w:pPr>
-        <w:pStyle w:val="BodyText"/>
-        <w:spacing w:line="480" w:lineRule="auto"/>
-      </w:pPr>
-      <w:r>
-        <w:rPr>
-          <w:rFonts w:ascii="Times New Roman" w:hAnsi="Times New Roman"/>
-          <w:sz w:val="24"/>
-        </w:rPr>
-        <w:t xml:space="preserve">George, T. (2024, May 9). What are credible sources &amp; how to spot them | Examples.</w:t>
-      </w:r>
-      <w:r>
-        <w:rPr>
-          <w:rFonts w:ascii="Times New Roman" w:hAnsi="Times New Roman"/>
-          <w:sz w:val="24"/>
-        </w:rPr>
-        <w:t xml:space="preserve"> </w:t>
-      </w:r>
-      <w:r>
-        <w:rPr>
-          <w:rFonts w:ascii="Times New Roman" w:hAnsi="Times New Roman"/>
-          <w:i/>
-          <w:iCs/>
-          <w:sz w:val="24"/>
-        </w:rPr>
         <w:t xml:space="preserve">Scribbr</w:t>
       </w:r>
       <w:r>
@@ -993,42 +807,6 @@
           <w:sz w:val="24"/>
         </w:rPr>
         <w:t xml:space="preserve">. Retrieved January 31, 2026, from https://www.scribbr.com/working-with-sources/credible-sources/</w:t>
-      </w:r>
-    </w:p>
-    <w:p>
-      <w:pPr>
-        <w:pStyle w:val="BodyText"/>
-        <w:spacing w:line="480" w:lineRule="auto"/>
-      </w:pPr>
-      <w:r>
-        <w:rPr>
-          <w:rFonts w:ascii="Times New Roman" w:hAnsi="Times New Roman"/>
-          <w:sz w:val="24"/>
-        </w:rPr>
-        <w:t xml:space="preserve">National Cyber Security Alliance. (2023).</w:t>
-      </w:r>
-      <w:r>
-        <w:rPr>
-          <w:rFonts w:ascii="Times New Roman" w:hAnsi="Times New Roman"/>
-          <w:sz w:val="24"/>
-        </w:rPr>
-        <w:t xml:space="preserve"> </w:t>
-      </w:r>
-      <w:r>
-        <w:rPr>
-          <w:rFonts w:ascii="Times New Roman" w:hAnsi="Times New Roman"/>
-          <w:i/>
-          <w:iCs/>
-          <w:sz w:val="24"/>
-        </w:rPr>
-        <w:t xml:space="preserve">Small business cybersecurity statistics</w:t>
-      </w:r>
-      <w:r>
-        <w:rPr>
-          <w:rFonts w:ascii="Times New Roman" w:hAnsi="Times New Roman"/>
-          <w:sz w:val="24"/>
-        </w:rPr>
-        <w:t xml:space="preserve">. Retrieved January 31, 2026, from https://staysafeonline.org/</w:t>
       </w:r>
     </w:p>
     <w:p>

</xml_diff>

<commit_message>
Improve accuracy: Add specific source usage explanations and enhance hypothesis methodology
</commit_message>
<xml_diff>
--- a/ENGL1102_English_Composition_2/Unit2_Research_Sources/Assignment/Unit2_Written_Assignment_FORMATTED.docx
+++ b/ENGL1102_English_Composition_2/Unit2_Research_Sources/Assignment/Unit2_Written_Assignment_FORMATTED.docx
@@ -158,7 +158,91 @@
           <w:rFonts w:ascii="Times New Roman" w:hAnsi="Times New Roman"/>
           <w:sz w:val="24"/>
         </w:rPr>
-        <w:t xml:space="preserve">This hypothesis is testable and measurable through quantitative comparison of breach incidents between businesses with comprehensive versus minimal cybersecurity investments. The 10% budget allocation aligns with industry best practices for small business security investments, while the 24-month timeframe provides sufficient data collection period to observe meaningful patterns in breach prevention outcomes.</w:t>
+        <w:t xml:space="preserve">This hypothesis is testable and measurable through quantitative comparison of breach incidents between two groups: businesses implementing comprehensive security measures versus those with minimal investment. The 10% budget allocation represents a realistic threshold based on industry recommendations, while the 24-month timeframe provides sufficient data collection period to observe meaningful patterns in breach prevention outcomes. The hypothesis can be validated through controlled studies comparing breach frequency, severity, and financial impact across both business groups, with clear operational definitions for</w:t>
+      </w:r>
+      <w:r>
+        <w:rPr>
+          <w:rFonts w:ascii="Times New Roman" w:hAnsi="Times New Roman"/>
+          <w:sz w:val="24"/>
+        </w:rPr>
+        <w:t xml:space="preserve"> </w:t>
+      </w:r>
+      <w:r>
+        <w:rPr>
+          <w:rFonts w:ascii="Times New Roman" w:hAnsi="Times New Roman"/>
+          <w:sz w:val="24"/>
+        </w:rPr>
+        <w:t xml:space="preserve">“</w:t>
+      </w:r>
+      <w:r>
+        <w:rPr>
+          <w:rFonts w:ascii="Times New Roman" w:hAnsi="Times New Roman"/>
+          <w:sz w:val="24"/>
+        </w:rPr>
+        <w:t xml:space="preserve">comprehensive</w:t>
+      </w:r>
+      <w:r>
+        <w:rPr>
+          <w:rFonts w:ascii="Times New Roman" w:hAnsi="Times New Roman"/>
+          <w:sz w:val="24"/>
+        </w:rPr>
+        <w:t xml:space="preserve">”</w:t>
+      </w:r>
+      <w:r>
+        <w:rPr>
+          <w:rFonts w:ascii="Times New Roman" w:hAnsi="Times New Roman"/>
+          <w:sz w:val="24"/>
+        </w:rPr>
+        <w:t xml:space="preserve"> </w:t>
+      </w:r>
+      <w:r>
+        <w:rPr>
+          <w:rFonts w:ascii="Times New Roman" w:hAnsi="Times New Roman"/>
+          <w:sz w:val="24"/>
+        </w:rPr>
+        <w:t xml:space="preserve">versus</w:t>
+      </w:r>
+      <w:r>
+        <w:rPr>
+          <w:rFonts w:ascii="Times New Roman" w:hAnsi="Times New Roman"/>
+          <w:sz w:val="24"/>
+        </w:rPr>
+        <w:t xml:space="preserve"> </w:t>
+      </w:r>
+      <w:r>
+        <w:rPr>
+          <w:rFonts w:ascii="Times New Roman" w:hAnsi="Times New Roman"/>
+          <w:sz w:val="24"/>
+        </w:rPr>
+        <w:t xml:space="preserve">“</w:t>
+      </w:r>
+      <w:r>
+        <w:rPr>
+          <w:rFonts w:ascii="Times New Roman" w:hAnsi="Times New Roman"/>
+          <w:sz w:val="24"/>
+        </w:rPr>
+        <w:t xml:space="preserve">minimal</w:t>
+      </w:r>
+      <w:r>
+        <w:rPr>
+          <w:rFonts w:ascii="Times New Roman" w:hAnsi="Times New Roman"/>
+          <w:sz w:val="24"/>
+        </w:rPr>
+        <w:t xml:space="preserve">”</w:t>
+      </w:r>
+      <w:r>
+        <w:rPr>
+          <w:rFonts w:ascii="Times New Roman" w:hAnsi="Times New Roman"/>
+          <w:sz w:val="24"/>
+        </w:rPr>
+        <w:t xml:space="preserve"> </w:t>
+      </w:r>
+      <w:r>
+        <w:rPr>
+          <w:rFonts w:ascii="Times New Roman" w:hAnsi="Times New Roman"/>
+          <w:sz w:val="24"/>
+        </w:rPr>
+        <w:t xml:space="preserve">cybersecurity investments.</w:t>
       </w:r>
     </w:p>
     <w:p>
@@ -268,7 +352,49 @@
           <w:rFonts w:ascii="Times New Roman" w:hAnsi="Times New Roman"/>
           <w:sz w:val="24"/>
         </w:rPr>
-        <w:t xml:space="preserve">: CISA is the authoritative U.S. federal agency for cybersecurity infrastructure protection under the Department of Homeland Security. As a .gov domain with no commercial interests, it provides unbiased, expert-developed guidance informed by national threat intelligence. The agency collaborates with private sector partners and academic institutions to create evidence-based recommendations regularly updated for emerging threats, making it highly reliable for foundational cybersecurity best practices.</w:t>
+        <w:t xml:space="preserve">: CISA is the authoritative U.S. federal agency for cybersecurity infrastructure protection under the Department of Homeland Security. As a .gov domain with no commercial interests, it provides unbiased, expert-developed guidance informed by national threat intelligence. The agency collaborates with private sector partners and academic institutions to create evidence-based recommendations regularly updated for emerging threats. CISA’s resources will provide foundational best practices for defining</w:t>
+      </w:r>
+      <w:r>
+        <w:rPr>
+          <w:rFonts w:ascii="Times New Roman" w:hAnsi="Times New Roman"/>
+          <w:sz w:val="24"/>
+        </w:rPr>
+        <w:t xml:space="preserve"> </w:t>
+      </w:r>
+      <w:r>
+        <w:rPr>
+          <w:rFonts w:ascii="Times New Roman" w:hAnsi="Times New Roman"/>
+          <w:sz w:val="24"/>
+        </w:rPr>
+        <w:t xml:space="preserve">“</w:t>
+      </w:r>
+      <w:r>
+        <w:rPr>
+          <w:rFonts w:ascii="Times New Roman" w:hAnsi="Times New Roman"/>
+          <w:sz w:val="24"/>
+        </w:rPr>
+        <w:t xml:space="preserve">comprehensive cybersecurity measures</w:t>
+      </w:r>
+      <w:r>
+        <w:rPr>
+          <w:rFonts w:ascii="Times New Roman" w:hAnsi="Times New Roman"/>
+          <w:sz w:val="24"/>
+        </w:rPr>
+        <w:t xml:space="preserve">”</w:t>
+      </w:r>
+      <w:r>
+        <w:rPr>
+          <w:rFonts w:ascii="Times New Roman" w:hAnsi="Times New Roman"/>
+          <w:sz w:val="24"/>
+        </w:rPr>
+        <w:t xml:space="preserve"> </w:t>
+      </w:r>
+      <w:r>
+        <w:rPr>
+          <w:rFonts w:ascii="Times New Roman" w:hAnsi="Times New Roman"/>
+          <w:sz w:val="24"/>
+        </w:rPr>
+        <w:t xml:space="preserve">in the research hypothesis, including specific controls like employee training programs, multi-factor authentication implementation, and security audit protocols that small businesses should adopt.</w:t>
       </w:r>
     </w:p>
     <w:bookmarkEnd w:id="21"/>
@@ -380,7 +506,7 @@
           <w:rFonts w:ascii="Times New Roman" w:hAnsi="Times New Roman"/>
           <w:sz w:val="24"/>
         </w:rPr>
-        <w:t xml:space="preserve">is a peer-reviewed academic journal published by Emerald Publishing, ensuring multiple independent experts evaluate research methodology before publication (George, 2024). The authors, Martin Eling and Werner Schnell from the University of St. Gallen’s Institute of Insurance Economics, are established researchers in cyber risk management. Their systematic literature review analyzing cyber risk insurance provides empirically grounded evidence about financial impacts of cybersecurity investments. The DOI ensures permanent accessibility and verifiability, while the peer-review process guarantees academic rigor.</w:t>
+        <w:t xml:space="preserve">is a peer-reviewed academic journal published by Emerald Publishing, ensuring multiple independent experts evaluate research methodology before publication (George, 2024). The authors, Martin Eling and Werner Schnell from the University of St. Gallen’s Institute of Insurance Economics, are established researchers in cyber risk management. Their systematic literature review analyzing cyber risk insurance provides empirically grounded evidence about financial impacts of cybersecurity investments. This source will inform the research by providing quantitative data on how security investments correlate with reduced breach costs and insurance claims, supporting the hypothesis that proactive cybersecurity spending prevents financial losses from data breaches.</w:t>
       </w:r>
     </w:p>
     <w:bookmarkEnd w:id="22"/>
@@ -462,7 +588,7 @@
           <w:rFonts w:ascii="Times New Roman" w:hAnsi="Times New Roman"/>
           <w:sz w:val="24"/>
         </w:rPr>
-        <w:t xml:space="preserve">: The Verizon DBIR analyzes real-world breaches across multiple sectors with comprehensive methodology—the 2023 report examined 16,312 security incidents and 5,199 confirmed breaches from 94 contributing organizations worldwide (Verizon, 2023). This large sample size provides statistical reliability beyond individual case studies. The report’s methodological transparency and widespread citation by academic researchers, government agencies, and security professionals demonstrate cross-sector validation despite Verizon’s commercial status.</w:t>
+        <w:t xml:space="preserve">: The Verizon DBIR analyzes real-world breaches across multiple sectors with comprehensive methodology—the 2023 report examined 16,312 security incidents and 5,199 confirmed breaches from 94 contributing organizations worldwide (Verizon, 2023). This large sample size provides statistical reliability beyond individual case studies. The report’s methodological transparency and widespread citation by academic researchers, government agencies, and security professionals demonstrate cross-sector validation. This source will provide empirical baseline data on breach frequency and attack vectors targeting small businesses, enabling comparison of breach rates between businesses with varying levels of cybersecurity investment and establishing realistic expectations for the 50% reduction target in the hypothesis.</w:t>
       </w:r>
     </w:p>
     <w:bookmarkEnd w:id="23"/>
@@ -544,7 +670,49 @@
           <w:rFonts w:ascii="Times New Roman" w:hAnsi="Times New Roman"/>
           <w:sz w:val="24"/>
         </w:rPr>
-        <w:t xml:space="preserve">: NIST is a non-regulatory federal agency developing technology standards and guidelines. The NIST Cybersecurity Framework is internationally recognized as the gold standard for organizational risk management, adopted by businesses and governments worldwide. Its credibility stems from extensive collaboration with private sector stakeholders, academic experts, and international partners. As a .gov source, it provides unbiased, evidence-based guidance with regular updates ensuring relevance to evolving threats.</w:t>
+        <w:t xml:space="preserve">: NIST is a non-regulatory federal agency developing technology standards and guidelines. The NIST Cybersecurity Framework is internationally recognized as the gold standard for organizational risk management, adopted by businesses and governments worldwide. Its credibility stems from extensive collaboration with private sector stakeholders, academic experts, and international partners. As a .gov source, it provides unbiased, evidence-based guidance with regular updates ensuring relevance to evolving threats. This framework will provide the structured methodology for categorizing and measuring cybersecurity controls, enabling consistent evaluation of whether businesses meet the</w:t>
+      </w:r>
+      <w:r>
+        <w:rPr>
+          <w:rFonts w:ascii="Times New Roman" w:hAnsi="Times New Roman"/>
+          <w:sz w:val="24"/>
+        </w:rPr>
+        <w:t xml:space="preserve"> </w:t>
+      </w:r>
+      <w:r>
+        <w:rPr>
+          <w:rFonts w:ascii="Times New Roman" w:hAnsi="Times New Roman"/>
+          <w:sz w:val="24"/>
+        </w:rPr>
+        <w:t xml:space="preserve">“</w:t>
+      </w:r>
+      <w:r>
+        <w:rPr>
+          <w:rFonts w:ascii="Times New Roman" w:hAnsi="Times New Roman"/>
+          <w:sz w:val="24"/>
+        </w:rPr>
+        <w:t xml:space="preserve">comprehensive</w:t>
+      </w:r>
+      <w:r>
+        <w:rPr>
+          <w:rFonts w:ascii="Times New Roman" w:hAnsi="Times New Roman"/>
+          <w:sz w:val="24"/>
+        </w:rPr>
+        <w:t xml:space="preserve">”</w:t>
+      </w:r>
+      <w:r>
+        <w:rPr>
+          <w:rFonts w:ascii="Times New Roman" w:hAnsi="Times New Roman"/>
+          <w:sz w:val="24"/>
+        </w:rPr>
+        <w:t xml:space="preserve"> </w:t>
+      </w:r>
+      <w:r>
+        <w:rPr>
+          <w:rFonts w:ascii="Times New Roman" w:hAnsi="Times New Roman"/>
+          <w:sz w:val="24"/>
+        </w:rPr>
+        <w:t xml:space="preserve">threshold defined in the hypothesis through standardized assessment criteria.</w:t>
       </w:r>
     </w:p>
     <w:bookmarkEnd w:id="24"/>
@@ -626,7 +794,7 @@
           <w:rFonts w:ascii="Times New Roman" w:hAnsi="Times New Roman"/>
           <w:sz w:val="24"/>
         </w:rPr>
-        <w:t xml:space="preserve">: The U.S. Small Business Administration is a federal agency dedicated to supporting American small businesses. As a .gov source with no commercial interests, it provides authoritative, unbiased guidance specifically tailored to small business needs and constraints. The SBA collaborates with cybersecurity experts and industry partners to develop practical, actionable recommendations. This resource addresses the unique economic vulnerabilities and resource limitations small businesses face when implementing cybersecurity measures, providing business-focused analysis that complements technical sources.</w:t>
+        <w:t xml:space="preserve">: The U.S. Small Business Administration is a federal agency dedicated to supporting American small businesses. As a .gov source with no commercial interests, it provides authoritative, unbiased guidance specifically tailored to small business needs and constraints. The SBA collaborates with cybersecurity experts and industry partners to develop practical, actionable recommendations. This resource will inform the research by addressing the unique economic vulnerabilities and resource limitations small businesses face when implementing cybersecurity measures, helping establish realistic budget allocation benchmarks and identifying cost-effective security controls that deliver maximum breach prevention impact within the 10% IT budget constraint.</w:t>
       </w:r>
     </w:p>
     <w:p>

</xml_diff>